<commit_message>
Update NBA2K editor data and function docs
</commit_message>
<xml_diff>
--- a/tests/baselines/player baseline.docx
+++ b/tests/baselines/player baseline.docx
@@ -463,7 +463,7 @@
           </w:tcPr>
           <w:p>
             <w:r>
-              <w:t>Gender Created F</w:t>
+              <w:t xml:space="preserve">Gender Created </w:t>
             </w:r>
           </w:p>
         </w:tc>
@@ -570,8 +570,13 @@
           </w:tcPr>
           <w:p>
             <w:r>
-              <w:t>Secondary Positi</w:t>
-            </w:r>
+              <w:t xml:space="preserve">Secondary </w:t>
+            </w:r>
+            <w:proofErr w:type="spellStart"/>
+            <w:r>
+              <w:t>Positi</w:t>
+            </w:r>
+            <w:proofErr w:type="spellEnd"/>
           </w:p>
         </w:tc>
         <w:tc>
@@ -849,8 +854,13 @@
           </w:tcPr>
           <w:p>
             <w:r>
-              <w:t>Draft Pick Numbe</w:t>
-            </w:r>
+              <w:t xml:space="preserve">Draft Pick </w:t>
+            </w:r>
+            <w:proofErr w:type="spellStart"/>
+            <w:r>
+              <w:t>Numbe</w:t>
+            </w:r>
+            <w:proofErr w:type="spellEnd"/>
           </w:p>
         </w:tc>
         <w:tc>
@@ -1035,7 +1045,7 @@
           </w:tcPr>
           <w:p>
             <w:r>
-              <w:t>120</w:t>
+              <w:t>85</w:t>
             </w:r>
           </w:p>
         </w:tc>
@@ -1057,7 +1067,10 @@
           </w:tcPr>
           <w:p>
             <w:r>
-              <w:t>101</w:t>
+              <w:t>9</w:t>
+            </w:r>
+            <w:r>
+              <w:t>3</w:t>
             </w:r>
           </w:p>
         </w:tc>
@@ -1200,9 +1213,11 @@
             <w:tcW w:w="4320" w:type="dxa"/>
           </w:tcPr>
           <w:p>
+            <w:proofErr w:type="spellStart"/>
             <w:r>
               <w:t>Loyality</w:t>
             </w:r>
+            <w:proofErr w:type="spellEnd"/>
           </w:p>
         </w:tc>
         <w:tc>
@@ -1943,8 +1958,6 @@
       </w:r>
       <w:r>
         <w:br/>
-      </w:r>
-      <w:r>
         <w:t>Shoes/Gear</w:t>
       </w:r>
     </w:p>
@@ -2019,7 +2032,15 @@
           </w:tcPr>
           <w:p>
             <w:r>
-              <w:t>7732-New Balance Hesi Low 2 V2</w:t>
+              <w:t xml:space="preserve">7732-New Balance </w:t>
+            </w:r>
+            <w:proofErr w:type="spellStart"/>
+            <w:r>
+              <w:t>Hesi</w:t>
+            </w:r>
+            <w:proofErr w:type="spellEnd"/>
+            <w:r>
+              <w:t xml:space="preserve"> Low 2 V2</w:t>
             </w:r>
           </w:p>
         </w:tc>
@@ -2041,7 +2062,15 @@
           </w:tcPr>
           <w:p>
             <w:r>
-              <w:t>7732-New Balance Hesi Low 2 V2</w:t>
+              <w:t xml:space="preserve">7732-New Balance </w:t>
+            </w:r>
+            <w:proofErr w:type="spellStart"/>
+            <w:r>
+              <w:t>Hesi</w:t>
+            </w:r>
+            <w:proofErr w:type="spellEnd"/>
+            <w:r>
+              <w:t xml:space="preserve"> Low 2 V2</w:t>
             </w:r>
           </w:p>
         </w:tc>
@@ -2326,8 +2355,6 @@
       </w:r>
       <w:r>
         <w:br/>
-      </w:r>
-      <w:r>
         <w:t>Upper Body Accessories</w:t>
       </w:r>
     </w:p>
@@ -3914,8 +3941,13 @@
           </w:tcPr>
           <w:p>
             <w:r>
-              <w:t>Offensive Rebou</w:t>
-            </w:r>
+              <w:t xml:space="preserve">Offensive </w:t>
+            </w:r>
+            <w:proofErr w:type="spellStart"/>
+            <w:r>
+              <w:t>Rebou</w:t>
+            </w:r>
+            <w:proofErr w:type="spellEnd"/>
           </w:p>
         </w:tc>
         <w:tc>
@@ -4087,8 +4119,13 @@
           </w:tcPr>
           <w:p>
             <w:r>
-              <w:t>Defensive Rebou</w:t>
-            </w:r>
+              <w:t xml:space="preserve">Defensive </w:t>
+            </w:r>
+            <w:proofErr w:type="spellStart"/>
+            <w:r>
+              <w:t>Rebou</w:t>
+            </w:r>
+            <w:proofErr w:type="spellEnd"/>
           </w:p>
         </w:tc>
         <w:tc>
@@ -4131,8 +4168,13 @@
           </w:tcPr>
           <w:p>
             <w:r>
-              <w:t>Perimeter Defens</w:t>
-            </w:r>
+              <w:t xml:space="preserve">Perimeter </w:t>
+            </w:r>
+            <w:proofErr w:type="spellStart"/>
+            <w:r>
+              <w:t>Defens</w:t>
+            </w:r>
+            <w:proofErr w:type="spellEnd"/>
           </w:p>
         </w:tc>
         <w:tc>
@@ -4588,8 +4630,13 @@
           </w:tcPr>
           <w:p>
             <w:r>
-              <w:t>Left Hip Durabilit</w:t>
-            </w:r>
+              <w:t xml:space="preserve">Left Hip </w:t>
+            </w:r>
+            <w:proofErr w:type="spellStart"/>
+            <w:r>
+              <w:t>Durabilit</w:t>
+            </w:r>
+            <w:proofErr w:type="spellEnd"/>
           </w:p>
         </w:tc>
         <w:tc>
@@ -4610,8 +4657,13 @@
           </w:tcPr>
           <w:p>
             <w:r>
-              <w:t>Right Hip Durabi</w:t>
-            </w:r>
+              <w:t xml:space="preserve">Right Hip </w:t>
+            </w:r>
+            <w:proofErr w:type="spellStart"/>
+            <w:r>
+              <w:t>Durabi</w:t>
+            </w:r>
+            <w:proofErr w:type="spellEnd"/>
           </w:p>
         </w:tc>
         <w:tc>
@@ -4632,8 +4684,13 @@
           </w:tcPr>
           <w:p>
             <w:r>
-              <w:t>Left Knee Durabil</w:t>
-            </w:r>
+              <w:t xml:space="preserve">Left Knee </w:t>
+            </w:r>
+            <w:proofErr w:type="spellStart"/>
+            <w:r>
+              <w:t>Durabil</w:t>
+            </w:r>
+            <w:proofErr w:type="spellEnd"/>
           </w:p>
         </w:tc>
         <w:tc>
@@ -4720,8 +4777,13 @@
           </w:tcPr>
           <w:p>
             <w:r>
-              <w:t>Left Foot Durabil</w:t>
-            </w:r>
+              <w:t xml:space="preserve">Left Foot </w:t>
+            </w:r>
+            <w:proofErr w:type="spellStart"/>
+            <w:r>
+              <w:t>Durabil</w:t>
+            </w:r>
+            <w:proofErr w:type="spellEnd"/>
           </w:p>
         </w:tc>
         <w:tc>
@@ -4849,8 +4911,13 @@
           </w:tcPr>
           <w:p>
             <w:r>
-              <w:t>Defensive Consis</w:t>
-            </w:r>
+              <w:t xml:space="preserve">Defensive </w:t>
+            </w:r>
+            <w:proofErr w:type="spellStart"/>
+            <w:r>
+              <w:t>Consis</w:t>
+            </w:r>
+            <w:proofErr w:type="spellEnd"/>
           </w:p>
         </w:tc>
         <w:tc>
@@ -4893,8 +4960,13 @@
           </w:tcPr>
           <w:p>
             <w:r>
-              <w:t>Offensive Consisi</w:t>
-            </w:r>
+              <w:t xml:space="preserve">Offensive </w:t>
+            </w:r>
+            <w:proofErr w:type="spellStart"/>
+            <w:r>
+              <w:t>Consisi</w:t>
+            </w:r>
+            <w:proofErr w:type="spellEnd"/>
           </w:p>
         </w:tc>
         <w:tc>
@@ -4913,9 +4985,11 @@
       <w:pPr>
         <w:pStyle w:val="Heading2"/>
       </w:pPr>
+      <w:proofErr w:type="spellStart"/>
       <w:r>
         <w:t>Misc</w:t>
       </w:r>
+      <w:proofErr w:type="spellEnd"/>
     </w:p>
     <w:tbl>
       <w:tblPr>
@@ -5055,8 +5129,13 @@
           </w:tcPr>
           <w:p>
             <w:r>
-              <w:t>Step Through Sh</w:t>
-            </w:r>
+              <w:t xml:space="preserve">Step Through </w:t>
+            </w:r>
+            <w:proofErr w:type="spellStart"/>
+            <w:r>
+              <w:t>Sh</w:t>
+            </w:r>
+            <w:proofErr w:type="spellEnd"/>
           </w:p>
         </w:tc>
         <w:tc>
@@ -5143,8 +5222,13 @@
           </w:tcPr>
           <w:p>
             <w:r>
-              <w:t>Shot Close Middl</w:t>
-            </w:r>
+              <w:t xml:space="preserve">Shot Close </w:t>
+            </w:r>
+            <w:proofErr w:type="spellStart"/>
+            <w:r>
+              <w:t>Middl</w:t>
+            </w:r>
+            <w:proofErr w:type="spellEnd"/>
           </w:p>
         </w:tc>
         <w:tc>
@@ -5385,8 +5469,13 @@
           </w:tcPr>
           <w:p>
             <w:r>
-              <w:t>Spot Up Shot Thr</w:t>
-            </w:r>
+              <w:t xml:space="preserve">Spot Up Shot </w:t>
+            </w:r>
+            <w:proofErr w:type="spellStart"/>
+            <w:r>
+              <w:t>Thr</w:t>
+            </w:r>
+            <w:proofErr w:type="spellEnd"/>
           </w:p>
         </w:tc>
         <w:tc>
@@ -5473,8 +5562,13 @@
           </w:tcPr>
           <w:p>
             <w:r>
-              <w:t>Shot Three Cente</w:t>
-            </w:r>
+              <w:t xml:space="preserve">Shot Three </w:t>
+            </w:r>
+            <w:proofErr w:type="spellStart"/>
+            <w:r>
+              <w:t>Cente</w:t>
+            </w:r>
+            <w:proofErr w:type="spellEnd"/>
           </w:p>
         </w:tc>
         <w:tc>
@@ -5539,8 +5633,13 @@
           </w:tcPr>
           <w:p>
             <w:r>
-              <w:t>Contested Jumpe</w:t>
-            </w:r>
+              <w:t xml:space="preserve">Contested </w:t>
+            </w:r>
+            <w:proofErr w:type="spellStart"/>
+            <w:r>
+              <w:t>Jumpe</w:t>
+            </w:r>
+            <w:proofErr w:type="spellEnd"/>
           </w:p>
         </w:tc>
         <w:tc>
@@ -5582,8 +5681,13 @@
             <w:tcW w:w="4320" w:type="dxa"/>
           </w:tcPr>
           <w:p>
-            <w:r>
-              <w:t>Stepback Jumper (A)</w:t>
+            <w:proofErr w:type="spellStart"/>
+            <w:r>
+              <w:t>Stepback</w:t>
+            </w:r>
+            <w:proofErr w:type="spellEnd"/>
+            <w:r>
+              <w:t xml:space="preserve"> Jumper (A)</w:t>
             </w:r>
           </w:p>
         </w:tc>
@@ -5604,8 +5708,13 @@
             <w:tcW w:w="4320" w:type="dxa"/>
           </w:tcPr>
           <w:p>
-            <w:r>
-              <w:t>Stepback Jumper (B)</w:t>
+            <w:proofErr w:type="spellStart"/>
+            <w:r>
+              <w:t>Stepback</w:t>
+            </w:r>
+            <w:proofErr w:type="spellEnd"/>
+            <w:r>
+              <w:t xml:space="preserve"> Jumper (B)</w:t>
             </w:r>
           </w:p>
         </w:tc>
@@ -5671,8 +5780,13 @@
           </w:tcPr>
           <w:p>
             <w:r>
-              <w:t>Drive Pull Up Thr</w:t>
-            </w:r>
+              <w:t xml:space="preserve">Drive Pull Up </w:t>
+            </w:r>
+            <w:proofErr w:type="spellStart"/>
+            <w:r>
+              <w:t>Thr</w:t>
+            </w:r>
+            <w:proofErr w:type="spellEnd"/>
           </w:p>
         </w:tc>
         <w:tc>
@@ -6062,8 +6176,13 @@
           </w:tcPr>
           <w:p>
             <w:r>
-              <w:t>Triple Threat Pur</w:t>
-            </w:r>
+              <w:t xml:space="preserve">Triple Threat </w:t>
+            </w:r>
+            <w:proofErr w:type="spellStart"/>
+            <w:r>
+              <w:t>Pur</w:t>
+            </w:r>
+            <w:proofErr w:type="spellEnd"/>
           </w:p>
         </w:tc>
         <w:tc>
@@ -6172,8 +6291,13 @@
           </w:tcPr>
           <w:p>
             <w:r>
-              <w:t>Setup With Hesit</w:t>
-            </w:r>
+              <w:t xml:space="preserve">Setup With </w:t>
+            </w:r>
+            <w:proofErr w:type="spellStart"/>
+            <w:r>
+              <w:t>Hesit</w:t>
+            </w:r>
+            <w:proofErr w:type="spellEnd"/>
           </w:p>
         </w:tc>
         <w:tc>
@@ -6345,8 +6469,13 @@
           </w:tcPr>
           <w:p>
             <w:r>
-              <w:t>Driving Crossove</w:t>
-            </w:r>
+              <w:t xml:space="preserve">Driving </w:t>
+            </w:r>
+            <w:proofErr w:type="spellStart"/>
+            <w:r>
+              <w:t>Crossove</w:t>
+            </w:r>
+            <w:proofErr w:type="spellEnd"/>
           </w:p>
         </w:tc>
         <w:tc>
@@ -6521,8 +6650,13 @@
           </w:tcPr>
           <w:p>
             <w:r>
-              <w:t>No Driving Dribb</w:t>
-            </w:r>
+              <w:t xml:space="preserve">No Driving </w:t>
+            </w:r>
+            <w:proofErr w:type="spellStart"/>
+            <w:r>
+              <w:t>Dribb</w:t>
+            </w:r>
+            <w:proofErr w:type="spellEnd"/>
           </w:p>
         </w:tc>
         <w:tc>
@@ -6933,8 +7067,13 @@
           </w:tcPr>
           <w:p>
             <w:r>
-              <w:t>Post Up And Unc</w:t>
-            </w:r>
+              <w:t xml:space="preserve">Post Up And </w:t>
+            </w:r>
+            <w:proofErr w:type="spellStart"/>
+            <w:r>
+              <w:t>Unc</w:t>
+            </w:r>
+            <w:proofErr w:type="spellEnd"/>
           </w:p>
         </w:tc>
         <w:tc>
@@ -6978,8 +7117,13 @@
           </w:tcPr>
           <w:p>
             <w:r>
-              <w:t>Post Step Back Sh</w:t>
-            </w:r>
+              <w:t xml:space="preserve">Post Step Back </w:t>
+            </w:r>
+            <w:proofErr w:type="spellStart"/>
+            <w:r>
+              <w:t>Sh</w:t>
+            </w:r>
+            <w:proofErr w:type="spellEnd"/>
           </w:p>
         </w:tc>
         <w:tc>
@@ -7217,8 +7361,13 @@
           </w:tcPr>
           <w:p>
             <w:r>
-              <w:t>Iso vs. Elite Defe</w:t>
-            </w:r>
+              <w:t xml:space="preserve">Iso vs. Elite </w:t>
+            </w:r>
+            <w:proofErr w:type="spellStart"/>
+            <w:r>
+              <w:t>Defe</w:t>
+            </w:r>
+            <w:proofErr w:type="spellEnd"/>
           </w:p>
         </w:tc>
         <w:tc>
@@ -7239,8 +7388,13 @@
           </w:tcPr>
           <w:p>
             <w:r>
-              <w:t>Iso vs. Good Defe</w:t>
-            </w:r>
+              <w:t xml:space="preserve">Iso vs. Good </w:t>
+            </w:r>
+            <w:proofErr w:type="spellStart"/>
+            <w:r>
+              <w:t>Defe</w:t>
+            </w:r>
+            <w:proofErr w:type="spellEnd"/>
           </w:p>
         </w:tc>
         <w:tc>
@@ -7283,8 +7437,13 @@
           </w:tcPr>
           <w:p>
             <w:r>
-              <w:t>Iso vs. Poor Defe</w:t>
-            </w:r>
+              <w:t xml:space="preserve">Iso vs. Poor </w:t>
+            </w:r>
+            <w:proofErr w:type="spellStart"/>
+            <w:r>
+              <w:t>Defe</w:t>
+            </w:r>
+            <w:proofErr w:type="spellEnd"/>
           </w:p>
         </w:tc>
         <w:tc>
@@ -7695,8 +7854,13 @@
           </w:tcPr>
           <w:p>
             <w:r>
-              <w:t>Mid-Range Cente</w:t>
-            </w:r>
+              <w:t xml:space="preserve">Mid-Range </w:t>
+            </w:r>
+            <w:proofErr w:type="spellStart"/>
+            <w:r>
+              <w:t>Cente</w:t>
+            </w:r>
+            <w:proofErr w:type="spellEnd"/>
           </w:p>
         </w:tc>
         <w:tc>
@@ -7783,8 +7947,13 @@
           </w:tcPr>
           <w:p>
             <w:r>
-              <w:t>Three Left-Cente</w:t>
-            </w:r>
+              <w:t>Three Left-</w:t>
+            </w:r>
+            <w:proofErr w:type="spellStart"/>
+            <w:r>
+              <w:t>Cente</w:t>
+            </w:r>
+            <w:proofErr w:type="spellEnd"/>
           </w:p>
         </w:tc>
         <w:tc>
@@ -8018,9 +8187,11 @@
             <w:tcW w:w="4320" w:type="dxa"/>
           </w:tcPr>
           <w:p>
-            <w:r>
-              <w:t>普通</w:t>
-            </w:r>
+            <w:proofErr w:type="spellStart"/>
+            <w:r>
+              <w:t>Normal</w:t>
+            </w:r>
+            <w:proofErr w:type="spellEnd"/>
           </w:p>
         </w:tc>
       </w:tr>
@@ -8081,9 +8252,11 @@
             <w:tcW w:w="4320" w:type="dxa"/>
           </w:tcPr>
           <w:p>
-            <w:r>
-              <w:t>罚球</w:t>
-            </w:r>
+            <w:proofErr w:type="spellStart"/>
+            <w:r>
+              <w:t>Free Throw</w:t>
+            </w:r>
+            <w:proofErr w:type="spellEnd"/>
             <w:r>
               <w:t xml:space="preserve"> 9</w:t>
             </w:r>
@@ -8150,9 +8323,11 @@
             <w:tcW w:w="4320" w:type="dxa"/>
           </w:tcPr>
           <w:p>
-            <w:r>
-              <w:t>职业</w:t>
-            </w:r>
+            <w:proofErr w:type="spellStart"/>
+            <w:r>
+              <w:t>Pro</w:t>
+            </w:r>
+            <w:proofErr w:type="spellEnd"/>
           </w:p>
         </w:tc>
       </w:tr>
@@ -8257,9 +8432,11 @@
             <w:tcW w:w="4320" w:type="dxa"/>
           </w:tcPr>
           <w:p>
-            <w:r>
-              <w:t>基本单脚起跳单手扣篮</w:t>
-            </w:r>
+            <w:proofErr w:type="spellStart"/>
+            <w:r>
+              <w:t>Basic One-Foot One-Hand Dunk</w:t>
+            </w:r>
+            <w:proofErr w:type="spellEnd"/>
           </w:p>
         </w:tc>
       </w:tr>
@@ -8279,9 +8456,11 @@
             <w:tcW w:w="4320" w:type="dxa"/>
           </w:tcPr>
           <w:p>
-            <w:r>
-              <w:t>单脚起跳挂筐扣篮</w:t>
-            </w:r>
+            <w:proofErr w:type="spellStart"/>
+            <w:r>
+              <w:t>One-Foot Rim-Hang Dunk</w:t>
+            </w:r>
+            <w:proofErr w:type="spellEnd"/>
           </w:p>
         </w:tc>
       </w:tr>
@@ -8301,9 +8480,11 @@
             <w:tcW w:w="4320" w:type="dxa"/>
           </w:tcPr>
           <w:p>
-            <w:r>
-              <w:t>运动达人双脚起跳扣篮</w:t>
-            </w:r>
+            <w:proofErr w:type="spellStart"/>
+            <w:r>
+              <w:t>Athletic Two-Foot Dunk</w:t>
+            </w:r>
+            <w:proofErr w:type="spellEnd"/>
           </w:p>
         </w:tc>
       </w:tr>
@@ -8323,9 +8504,11 @@
             <w:tcW w:w="4320" w:type="dxa"/>
           </w:tcPr>
           <w:p>
-            <w:r>
-              <w:t>单脚起跳扣篮</w:t>
-            </w:r>
+            <w:proofErr w:type="spellStart"/>
+            <w:r>
+              <w:t>One-Foot Dunk</w:t>
+            </w:r>
+            <w:proofErr w:type="spellEnd"/>
           </w:p>
         </w:tc>
       </w:tr>
@@ -8346,7 +8529,7 @@
           </w:tcPr>
           <w:p>
             <w:r>
-              <w:t>无</w:t>
+              <w:t>None</w:t>
             </w:r>
           </w:p>
         </w:tc>
@@ -8368,7 +8551,7 @@
           </w:tcPr>
           <w:p>
             <w:r>
-              <w:t>无</w:t>
+              <w:t>None</w:t>
             </w:r>
           </w:p>
         </w:tc>
@@ -8390,7 +8573,7 @@
           </w:tcPr>
           <w:p>
             <w:r>
-              <w:t>无</w:t>
+              <w:t>None</w:t>
             </w:r>
           </w:p>
         </w:tc>
@@ -8412,7 +8595,7 @@
           </w:tcPr>
           <w:p>
             <w:r>
-              <w:t>无</w:t>
+              <w:t>None</w:t>
             </w:r>
           </w:p>
         </w:tc>
@@ -8434,7 +8617,7 @@
           </w:tcPr>
           <w:p>
             <w:r>
-              <w:t>无</w:t>
+              <w:t>None</w:t>
             </w:r>
           </w:p>
         </w:tc>
@@ -8456,7 +8639,7 @@
           </w:tcPr>
           <w:p>
             <w:r>
-              <w:t>无</w:t>
+              <w:t>None</w:t>
             </w:r>
           </w:p>
         </w:tc>
@@ -8478,7 +8661,7 @@
           </w:tcPr>
           <w:p>
             <w:r>
-              <w:t>无</w:t>
+              <w:t>None</w:t>
             </w:r>
           </w:p>
         </w:tc>
@@ -8500,7 +8683,7 @@
           </w:tcPr>
           <w:p>
             <w:r>
-              <w:t>无</w:t>
+              <w:t>None</w:t>
             </w:r>
           </w:p>
         </w:tc>
@@ -8522,7 +8705,7 @@
           </w:tcPr>
           <w:p>
             <w:r>
-              <w:t>无</w:t>
+              <w:t>None</w:t>
             </w:r>
           </w:p>
         </w:tc>
@@ -8544,7 +8727,7 @@
           </w:tcPr>
           <w:p>
             <w:r>
-              <w:t>无</w:t>
+              <w:t>None</w:t>
             </w:r>
           </w:p>
         </w:tc>
@@ -8566,7 +8749,7 @@
           </w:tcPr>
           <w:p>
             <w:r>
-              <w:t>无</w:t>
+              <w:t>None</w:t>
             </w:r>
           </w:p>
         </w:tc>
@@ -8628,9 +8811,11 @@
             <w:tcW w:w="4320" w:type="dxa"/>
           </w:tcPr>
           <w:p>
-            <w:r>
-              <w:t>职业</w:t>
-            </w:r>
+            <w:proofErr w:type="spellStart"/>
+            <w:r>
+              <w:t>Pro</w:t>
+            </w:r>
+            <w:proofErr w:type="spellEnd"/>
             <w:r>
               <w:t xml:space="preserve"> 2</w:t>
             </w:r>
@@ -8653,9 +8838,11 @@
             <w:tcW w:w="4320" w:type="dxa"/>
           </w:tcPr>
           <w:p>
-            <w:r>
-              <w:t>职业</w:t>
-            </w:r>
+            <w:proofErr w:type="spellStart"/>
+            <w:r>
+              <w:t>Pro</w:t>
+            </w:r>
+            <w:proofErr w:type="spellEnd"/>
           </w:p>
         </w:tc>
       </w:tr>
@@ -8675,9 +8862,11 @@
             <w:tcW w:w="4320" w:type="dxa"/>
           </w:tcPr>
           <w:p>
-            <w:r>
-              <w:t>职业</w:t>
-            </w:r>
+            <w:proofErr w:type="spellStart"/>
+            <w:r>
+              <w:t>Pro</w:t>
+            </w:r>
+            <w:proofErr w:type="spellEnd"/>
           </w:p>
         </w:tc>
       </w:tr>
@@ -8699,7 +8888,7 @@
           </w:tcPr>
           <w:p>
             <w:r>
-              <w:t>小</w:t>
+              <w:t>Small</w:t>
             </w:r>
           </w:p>
         </w:tc>
@@ -8720,9 +8909,11 @@
             <w:tcW w:w="4320" w:type="dxa"/>
           </w:tcPr>
           <w:p>
-            <w:r>
-              <w:t>精英</w:t>
-            </w:r>
+            <w:proofErr w:type="spellStart"/>
+            <w:r>
+              <w:t>Elite</w:t>
+            </w:r>
+            <w:proofErr w:type="spellEnd"/>
           </w:p>
         </w:tc>
       </w:tr>
@@ -8827,9 +9018,11 @@
             <w:tcW w:w="4320" w:type="dxa"/>
           </w:tcPr>
           <w:p>
-            <w:r>
-              <w:t>职业</w:t>
-            </w:r>
+            <w:proofErr w:type="spellStart"/>
+            <w:r>
+              <w:t>Pro</w:t>
+            </w:r>
+            <w:proofErr w:type="spellEnd"/>
           </w:p>
         </w:tc>
       </w:tr>
@@ -8906,18 +9099,25 @@
           </w:tcPr>
           <w:p>
             <w:r>
-              <w:t>Moving Crosso</w:t>
-            </w:r>
-          </w:p>
-        </w:tc>
-        <w:tc>
-          <w:tcPr>
-            <w:tcW w:w="4320" w:type="dxa"/>
-          </w:tcPr>
-          <w:p>
-            <w:r>
-              <w:t>普通</w:t>
-            </w:r>
+              <w:t xml:space="preserve">Moving </w:t>
+            </w:r>
+            <w:proofErr w:type="spellStart"/>
+            <w:r>
+              <w:t>Crosso</w:t>
+            </w:r>
+            <w:proofErr w:type="spellEnd"/>
+          </w:p>
+        </w:tc>
+        <w:tc>
+          <w:tcPr>
+            <w:tcW w:w="4320" w:type="dxa"/>
+          </w:tcPr>
+          <w:p>
+            <w:proofErr w:type="spellStart"/>
+            <w:r>
+              <w:t>Normal</w:t>
+            </w:r>
+            <w:proofErr w:type="spellEnd"/>
           </w:p>
         </w:tc>
       </w:tr>
@@ -8950,8 +9150,13 @@
           </w:tcPr>
           <w:p>
             <w:r>
-              <w:t>Moving Stepback</w:t>
-            </w:r>
+              <w:t xml:space="preserve">Moving </w:t>
+            </w:r>
+            <w:proofErr w:type="spellStart"/>
+            <w:r>
+              <w:t>Stepback</w:t>
+            </w:r>
+            <w:proofErr w:type="spellEnd"/>
           </w:p>
         </w:tc>
         <w:tc>
@@ -8994,8 +9199,13 @@
           </w:tcPr>
           <w:p>
             <w:r>
-              <w:t>Moving Hesitatio</w:t>
-            </w:r>
+              <w:t xml:space="preserve">Moving </w:t>
+            </w:r>
+            <w:proofErr w:type="spellStart"/>
+            <w:r>
+              <w:t>Hesitatio</w:t>
+            </w:r>
+            <w:proofErr w:type="spellEnd"/>
           </w:p>
         </w:tc>
         <w:tc>
@@ -9036,9 +9246,11 @@
       <w:pPr>
         <w:pStyle w:val="Heading3"/>
       </w:pPr>
+      <w:proofErr w:type="spellStart"/>
       <w:r>
         <w:t>Misc</w:t>
       </w:r>
+      <w:proofErr w:type="spellEnd"/>
     </w:p>
     <w:tbl>
       <w:tblPr>
@@ -9111,7 +9323,7 @@
           </w:tcPr>
           <w:p>
             <w:r>
-              <w:t>无</w:t>
+              <w:t>None</w:t>
             </w:r>
           </w:p>
         </w:tc>
@@ -9133,29 +9345,37 @@
           </w:tcPr>
           <w:p>
             <w:r>
-              <w:t>无</w:t>
-            </w:r>
-          </w:p>
-        </w:tc>
-      </w:tr>
-      <w:tr>
-        <w:tc>
-          <w:tcPr>
-            <w:tcW w:w="4320" w:type="dxa"/>
-          </w:tcPr>
-          <w:p>
-            <w:r>
-              <w:t>NBA Jumpball Rit</w:t>
-            </w:r>
-          </w:p>
-        </w:tc>
-        <w:tc>
-          <w:tcPr>
-            <w:tcW w:w="4320" w:type="dxa"/>
-          </w:tcPr>
-          <w:p>
-            <w:r>
-              <w:t>无</w:t>
+              <w:t>None</w:t>
+            </w:r>
+          </w:p>
+        </w:tc>
+      </w:tr>
+      <w:tr>
+        <w:tc>
+          <w:tcPr>
+            <w:tcW w:w="4320" w:type="dxa"/>
+          </w:tcPr>
+          <w:p>
+            <w:r>
+              <w:t xml:space="preserve">NBA </w:t>
+            </w:r>
+            <w:proofErr w:type="spellStart"/>
+            <w:r>
+              <w:t>Jumpball</w:t>
+            </w:r>
+            <w:proofErr w:type="spellEnd"/>
+            <w:r>
+              <w:t xml:space="preserve"> Rit</w:t>
+            </w:r>
+          </w:p>
+        </w:tc>
+        <w:tc>
+          <w:tcPr>
+            <w:tcW w:w="4320" w:type="dxa"/>
+          </w:tcPr>
+          <w:p>
+            <w:r>
+              <w:t>None</w:t>
             </w:r>
           </w:p>
         </w:tc>
@@ -9176,9 +9396,11 @@
             <w:tcW w:w="4320" w:type="dxa"/>
           </w:tcPr>
           <w:p>
-            <w:r>
-              <w:t>激烈</w:t>
-            </w:r>
+            <w:proofErr w:type="spellStart"/>
+            <w:r>
+              <w:t>Intense</w:t>
+            </w:r>
+            <w:proofErr w:type="spellEnd"/>
           </w:p>
         </w:tc>
       </w:tr>
@@ -9198,9 +9420,11 @@
             <w:tcW w:w="4320" w:type="dxa"/>
           </w:tcPr>
           <w:p>
-            <w:r>
-              <w:t>关闭</w:t>
-            </w:r>
+            <w:proofErr w:type="spellStart"/>
+            <w:r>
+              <w:t>Off</w:t>
+            </w:r>
+            <w:proofErr w:type="spellEnd"/>
           </w:p>
         </w:tc>
       </w:tr>
@@ -9828,9 +10052,11 @@
             <w:tcW w:w="4320" w:type="dxa"/>
           </w:tcPr>
           <w:p>
+            <w:proofErr w:type="spellStart"/>
             <w:r>
               <w:t>Posterizer</w:t>
             </w:r>
+            <w:proofErr w:type="spellEnd"/>
           </w:p>
         </w:tc>
         <w:tc>
@@ -10068,8 +10294,13 @@
           </w:tcPr>
           <w:p>
             <w:r>
-              <w:t>Post Fade Pheno</w:t>
-            </w:r>
+              <w:t xml:space="preserve">Post Fade </w:t>
+            </w:r>
+            <w:proofErr w:type="spellStart"/>
+            <w:r>
+              <w:t>Pheno</w:t>
+            </w:r>
+            <w:proofErr w:type="spellEnd"/>
           </w:p>
         </w:tc>
         <w:tc>
@@ -10178,8 +10409,13 @@
           </w:tcPr>
           <w:p>
             <w:r>
-              <w:t>Set Shot Specialis</w:t>
-            </w:r>
+              <w:t xml:space="preserve">Set Shot </w:t>
+            </w:r>
+            <w:proofErr w:type="spellStart"/>
+            <w:r>
+              <w:t>Specialis</w:t>
+            </w:r>
+            <w:proofErr w:type="spellEnd"/>
           </w:p>
         </w:tc>
         <w:tc>
@@ -10350,9 +10586,11 @@
             <w:tcW w:w="4320" w:type="dxa"/>
           </w:tcPr>
           <w:p>
+            <w:proofErr w:type="spellStart"/>
             <w:r>
               <w:t>Unpluckable</w:t>
             </w:r>
+            <w:proofErr w:type="spellEnd"/>
           </w:p>
         </w:tc>
         <w:tc>
@@ -10373,8 +10611,13 @@
           </w:tcPr>
           <w:p>
             <w:r>
-              <w:t>Versatile Visionar</w:t>
-            </w:r>
+              <w:t xml:space="preserve">Versatile </w:t>
+            </w:r>
+            <w:proofErr w:type="spellStart"/>
+            <w:r>
+              <w:t>Visionar</w:t>
+            </w:r>
+            <w:proofErr w:type="spellEnd"/>
           </w:p>
         </w:tc>
         <w:tc>
@@ -10786,8 +11029,13 @@
           </w:tcPr>
           <w:p>
             <w:r>
-              <w:t>Immovable Enfor</w:t>
-            </w:r>
+              <w:t xml:space="preserve">Immovable </w:t>
+            </w:r>
+            <w:proofErr w:type="spellStart"/>
+            <w:r>
+              <w:t>Enfor</w:t>
+            </w:r>
+            <w:proofErr w:type="spellEnd"/>
           </w:p>
         </w:tc>
         <w:tc>
@@ -11000,8 +11248,13 @@
           </w:tcPr>
           <w:p>
             <w:r>
-              <w:t>Extremely Confid</w:t>
-            </w:r>
+              <w:t xml:space="preserve">Extremely </w:t>
+            </w:r>
+            <w:proofErr w:type="spellStart"/>
+            <w:r>
+              <w:t>Confid</w:t>
+            </w:r>
+            <w:proofErr w:type="spellEnd"/>
           </w:p>
         </w:tc>
         <w:tc>
@@ -11132,8 +11385,13 @@
           </w:tcPr>
           <w:p>
             <w:r>
-              <w:t>Media Ringmaste</w:t>
-            </w:r>
+              <w:t xml:space="preserve">Media </w:t>
+            </w:r>
+            <w:proofErr w:type="spellStart"/>
+            <w:r>
+              <w:t>Ringmaste</w:t>
+            </w:r>
+            <w:proofErr w:type="spellEnd"/>
           </w:p>
         </w:tc>
         <w:tc>
@@ -13550,6 +13808,7 @@
   <w:style w:type="character" w:default="1" w:styleId="DefaultParagraphFont">
     <w:name w:val="Default Paragraph Font"/>
     <w:uiPriority w:val="1"/>
+    <w:semiHidden/>
     <w:unhideWhenUsed/>
   </w:style>
   <w:style w:type="table" w:default="1" w:styleId="TableNormal">

</xml_diff>